<commit_message>
Fix OpenXML schema-validity bugs in Word and Excel output
Fix OpenXML schema-validity bugs in Word and Excel output

All produced documents that Word/Excel flag as corrupt on open; none were
caught because the Verify snapshots never ran OpenXmlValidator.

- Word rPr: emit children in CT_RPr order (rFonts, b, color, sz, szCs, u)
- Word standalone tblBorders: order top, left, bottom, right, insideH, insideV
- Excel worksheet: place conditionalFormatting/dataValidations before <hyperlinks>
- Excel font/fill rgb: write 8-digit ARGB and emit <color> before <name> in
  CT_Font; fixes every linked workbook and any 6-digit user color. List-link
  inline runs now order color before u.

Add OpenXmlValidator coverage for each path; re-verify affected snapshots.
</commit_message>
<xml_diff>
--- a/src/Excelsior.Tests/Word/WordTableBuilderTests.TableLevelHeadingStyleAppliesShadingAndFontToEveryHeaderCell.verified.docx
+++ b/src/Excelsior.Tests/Word/WordTableBuilderTests.TableLevelHeadingStyleAppliesShadingAndFontToEveryHeaderCell.verified.docx
@@ -28,12 +28,12 @@
             </w:pPr>
             <w:r>
               <w:rPr>
-                <w:b/>
-                <w:u w:val="single"/>
-                <w:color w:val="FFFFFF"/>
-                <w:sz w:val="24"/>
-                <w:szCs w:val="24"/>
-                <w:rFonts w:ascii="Arial" w:hAnsi="Arial"/>
+                <w:rFonts w:ascii="Arial" w:hAnsi="Arial"/>
+                <w:b/>
+                <w:color w:val="FFFFFF"/>
+                <w:sz w:val="24"/>
+                <w:szCs w:val="24"/>
+                <w:u w:val="single"/>
               </w:rPr>
               <w:t xml:space="preserve">Employee ID</w:t>
             </w:r>
@@ -49,12 +49,12 @@
             </w:pPr>
             <w:r>
               <w:rPr>
-                <w:b/>
-                <w:u w:val="single"/>
-                <w:color w:val="FFFFFF"/>
-                <w:sz w:val="24"/>
-                <w:szCs w:val="24"/>
-                <w:rFonts w:ascii="Arial" w:hAnsi="Arial"/>
+                <w:rFonts w:ascii="Arial" w:hAnsi="Arial"/>
+                <w:b/>
+                <w:color w:val="FFFFFF"/>
+                <w:sz w:val="24"/>
+                <w:szCs w:val="24"/>
+                <w:u w:val="single"/>
               </w:rPr>
               <w:t xml:space="preserve">Full Name</w:t>
             </w:r>
@@ -70,12 +70,12 @@
             </w:pPr>
             <w:r>
               <w:rPr>
-                <w:b/>
-                <w:u w:val="single"/>
-                <w:color w:val="FFFFFF"/>
-                <w:sz w:val="24"/>
-                <w:szCs w:val="24"/>
-                <w:rFonts w:ascii="Arial" w:hAnsi="Arial"/>
+                <w:rFonts w:ascii="Arial" w:hAnsi="Arial"/>
+                <w:b/>
+                <w:color w:val="FFFFFF"/>
+                <w:sz w:val="24"/>
+                <w:szCs w:val="24"/>
+                <w:u w:val="single"/>
               </w:rPr>
               <w:t xml:space="preserve">Email Address</w:t>
             </w:r>
@@ -91,12 +91,12 @@
             </w:pPr>
             <w:r>
               <w:rPr>
-                <w:b/>
-                <w:u w:val="single"/>
-                <w:color w:val="FFFFFF"/>
-                <w:sz w:val="24"/>
-                <w:szCs w:val="24"/>
-                <w:rFonts w:ascii="Arial" w:hAnsi="Arial"/>
+                <w:rFonts w:ascii="Arial" w:hAnsi="Arial"/>
+                <w:b/>
+                <w:color w:val="FFFFFF"/>
+                <w:sz w:val="24"/>
+                <w:szCs w:val="24"/>
+                <w:u w:val="single"/>
               </w:rPr>
               <w:t xml:space="preserve">Hire Date</w:t>
             </w:r>
@@ -112,12 +112,12 @@
             </w:pPr>
             <w:r>
               <w:rPr>
-                <w:b/>
-                <w:u w:val="single"/>
-                <w:color w:val="FFFFFF"/>
-                <w:sz w:val="24"/>
-                <w:szCs w:val="24"/>
-                <w:rFonts w:ascii="Arial" w:hAnsi="Arial"/>
+                <w:rFonts w:ascii="Arial" w:hAnsi="Arial"/>
+                <w:b/>
+                <w:color w:val="FFFFFF"/>
+                <w:sz w:val="24"/>
+                <w:szCs w:val="24"/>
+                <w:u w:val="single"/>
               </w:rPr>
               <w:t xml:space="preserve">Annual Salary</w:t>
             </w:r>
@@ -133,12 +133,12 @@
             </w:pPr>
             <w:r>
               <w:rPr>
-                <w:b/>
-                <w:u w:val="single"/>
-                <w:color w:val="FFFFFF"/>
-                <w:sz w:val="24"/>
-                <w:szCs w:val="24"/>
-                <w:rFonts w:ascii="Arial" w:hAnsi="Arial"/>
+                <w:rFonts w:ascii="Arial" w:hAnsi="Arial"/>
+                <w:b/>
+                <w:color w:val="FFFFFF"/>
+                <w:sz w:val="24"/>
+                <w:szCs w:val="24"/>
+                <w:u w:val="single"/>
               </w:rPr>
               <w:t xml:space="preserve">Is Active</w:t>
             </w:r>
@@ -154,12 +154,12 @@
             </w:pPr>
             <w:r>
               <w:rPr>
-                <w:b/>
-                <w:u w:val="single"/>
-                <w:color w:val="FFFFFF"/>
-                <w:sz w:val="24"/>
-                <w:szCs w:val="24"/>
-                <w:rFonts w:ascii="Arial" w:hAnsi="Arial"/>
+                <w:rFonts w:ascii="Arial" w:hAnsi="Arial"/>
+                <w:b/>
+                <w:color w:val="FFFFFF"/>
+                <w:sz w:val="24"/>
+                <w:szCs w:val="24"/>
+                <w:u w:val="single"/>
               </w:rPr>
               <w:t xml:space="preserve">Status</w:t>
             </w:r>

</xml_diff>

<commit_message>
Fix OpenXML schema-validity bugs in Word and Excel output (#238)
Fix OpenXML schema-validity bugs in Word and Excel output

All produced documents that Word/Excel flag as corrupt on open; none were
caught because the Verify snapshots never ran OpenXmlValidator.

- Word rPr: emit children in CT_RPr order (rFonts, b, color, sz, szCs, u)
- Word standalone tblBorders: order top, left, bottom, right, insideH, insideV
- Excel worksheet: place conditionalFormatting/dataValidations before <hyperlinks>
- Excel font/fill rgb: write 8-digit ARGB and emit <color> before <name> in
  CT_Font; fixes every linked workbook and any 6-digit user color. List-link
  inline runs now order color before u.

Add OpenXmlValidator coverage for each path; re-verify affected snapshots.
</commit_message>
<xml_diff>
--- a/src/Excelsior.Tests/Word/WordTableBuilderTests.TableLevelHeadingStyleAppliesShadingAndFontToEveryHeaderCell.verified.docx
+++ b/src/Excelsior.Tests/Word/WordTableBuilderTests.TableLevelHeadingStyleAppliesShadingAndFontToEveryHeaderCell.verified.docx
@@ -28,12 +28,12 @@
             </w:pPr>
             <w:r>
               <w:rPr>
-                <w:b/>
-                <w:u w:val="single"/>
-                <w:color w:val="FFFFFF"/>
-                <w:sz w:val="24"/>
-                <w:szCs w:val="24"/>
-                <w:rFonts w:ascii="Arial" w:hAnsi="Arial"/>
+                <w:rFonts w:ascii="Arial" w:hAnsi="Arial"/>
+                <w:b/>
+                <w:color w:val="FFFFFF"/>
+                <w:sz w:val="24"/>
+                <w:szCs w:val="24"/>
+                <w:u w:val="single"/>
               </w:rPr>
               <w:t xml:space="preserve">Employee ID</w:t>
             </w:r>
@@ -49,12 +49,12 @@
             </w:pPr>
             <w:r>
               <w:rPr>
-                <w:b/>
-                <w:u w:val="single"/>
-                <w:color w:val="FFFFFF"/>
-                <w:sz w:val="24"/>
-                <w:szCs w:val="24"/>
-                <w:rFonts w:ascii="Arial" w:hAnsi="Arial"/>
+                <w:rFonts w:ascii="Arial" w:hAnsi="Arial"/>
+                <w:b/>
+                <w:color w:val="FFFFFF"/>
+                <w:sz w:val="24"/>
+                <w:szCs w:val="24"/>
+                <w:u w:val="single"/>
               </w:rPr>
               <w:t xml:space="preserve">Full Name</w:t>
             </w:r>
@@ -70,12 +70,12 @@
             </w:pPr>
             <w:r>
               <w:rPr>
-                <w:b/>
-                <w:u w:val="single"/>
-                <w:color w:val="FFFFFF"/>
-                <w:sz w:val="24"/>
-                <w:szCs w:val="24"/>
-                <w:rFonts w:ascii="Arial" w:hAnsi="Arial"/>
+                <w:rFonts w:ascii="Arial" w:hAnsi="Arial"/>
+                <w:b/>
+                <w:color w:val="FFFFFF"/>
+                <w:sz w:val="24"/>
+                <w:szCs w:val="24"/>
+                <w:u w:val="single"/>
               </w:rPr>
               <w:t xml:space="preserve">Email Address</w:t>
             </w:r>
@@ -91,12 +91,12 @@
             </w:pPr>
             <w:r>
               <w:rPr>
-                <w:b/>
-                <w:u w:val="single"/>
-                <w:color w:val="FFFFFF"/>
-                <w:sz w:val="24"/>
-                <w:szCs w:val="24"/>
-                <w:rFonts w:ascii="Arial" w:hAnsi="Arial"/>
+                <w:rFonts w:ascii="Arial" w:hAnsi="Arial"/>
+                <w:b/>
+                <w:color w:val="FFFFFF"/>
+                <w:sz w:val="24"/>
+                <w:szCs w:val="24"/>
+                <w:u w:val="single"/>
               </w:rPr>
               <w:t xml:space="preserve">Hire Date</w:t>
             </w:r>
@@ -112,12 +112,12 @@
             </w:pPr>
             <w:r>
               <w:rPr>
-                <w:b/>
-                <w:u w:val="single"/>
-                <w:color w:val="FFFFFF"/>
-                <w:sz w:val="24"/>
-                <w:szCs w:val="24"/>
-                <w:rFonts w:ascii="Arial" w:hAnsi="Arial"/>
+                <w:rFonts w:ascii="Arial" w:hAnsi="Arial"/>
+                <w:b/>
+                <w:color w:val="FFFFFF"/>
+                <w:sz w:val="24"/>
+                <w:szCs w:val="24"/>
+                <w:u w:val="single"/>
               </w:rPr>
               <w:t xml:space="preserve">Annual Salary</w:t>
             </w:r>
@@ -133,12 +133,12 @@
             </w:pPr>
             <w:r>
               <w:rPr>
-                <w:b/>
-                <w:u w:val="single"/>
-                <w:color w:val="FFFFFF"/>
-                <w:sz w:val="24"/>
-                <w:szCs w:val="24"/>
-                <w:rFonts w:ascii="Arial" w:hAnsi="Arial"/>
+                <w:rFonts w:ascii="Arial" w:hAnsi="Arial"/>
+                <w:b/>
+                <w:color w:val="FFFFFF"/>
+                <w:sz w:val="24"/>
+                <w:szCs w:val="24"/>
+                <w:u w:val="single"/>
               </w:rPr>
               <w:t xml:space="preserve">Is Active</w:t>
             </w:r>
@@ -154,12 +154,12 @@
             </w:pPr>
             <w:r>
               <w:rPr>
-                <w:b/>
-                <w:u w:val="single"/>
-                <w:color w:val="FFFFFF"/>
-                <w:sz w:val="24"/>
-                <w:szCs w:val="24"/>
-                <w:rFonts w:ascii="Arial" w:hAnsi="Arial"/>
+                <w:rFonts w:ascii="Arial" w:hAnsi="Arial"/>
+                <w:b/>
+                <w:color w:val="FFFFFF"/>
+                <w:sz w:val="24"/>
+                <w:szCs w:val="24"/>
+                <w:u w:val="single"/>
               </w:rPr>
               <w:t xml:space="preserve">Status</w:t>
             </w:r>

</xml_diff>